<commit_message>
chore: checkpoint MAGI recovery updates
</commit_message>
<xml_diff>
--- a/templates/laf_poa/indigenous_center.docx
+++ b/templates/laf_poa/indigenous_center.docx
@@ -413,8 +413,88 @@
             <w:vAlign w:val="center"/>
           </w:tcPr>
           <w:p>
-            <w:r>
-              <w:t>本會申請編號：{{LAF_CASE_NUMBER}}    案號：{{COURT_CASE_NUMBER}}</w:t>
+            <w:pPr>
+              <w:rPr>
+                <w:rFonts w:ascii="標楷體" w:eastAsia="標楷體" w:cs="標楷體"/>
+                <w:u w:val="single"/>
+              </w:rPr>
+            </w:pPr>
+            <w:r>
+              <w:rPr>
+                <w:rFonts w:ascii="標楷體" w:eastAsia="標楷體" w:cs="標楷體" w:hint="eastAsia"/>
+              </w:rPr>
+              <w:t>本會申請編號：</w:t>
+            </w:r>
+            <w:r>
+              <w:rPr>
+                <w:rFonts w:ascii="標楷體" w:eastAsia="標楷體" w:hAnsi="標楷體" w:cs="標楷體" w:hint="eastAsia"/>
+                <w:noProof/>
+                <w:u w:val="single"/>
+              </w:rPr>
+              <w:t>{{LAF_CASE_NUMBER}}</w:t>
+            </w:r>
+          </w:p>
+          <w:p>
+            <w:pPr>
+              <w:ind w:left="4680" w:hanging="4680"/>
+              <w:jc w:val="both"/>
+              <w:rPr>
+                <w:rFonts w:ascii="標楷體" w:eastAsia="標楷體" w:cs="標楷體"/>
+              </w:rPr>
+            </w:pPr>
+            <w:r>
+              <w:rPr>
+                <w:rFonts w:ascii="標楷體" w:eastAsia="標楷體" w:cs="標楷體" w:hint="eastAsia"/>
+              </w:rPr>
+              <w:t>案號：</w:t>
+            </w:r>
+            <w:r>
+              <w:rPr>
+                <w:rFonts w:ascii="標楷體" w:eastAsia="標楷體" w:cs="標楷體"/>
+              </w:rPr>
+              <w:t xml:space="preserve">     </w:t>
+            </w:r>
+            <w:r>
+              <w:rPr>
+                <w:rFonts w:ascii="標楷體" w:eastAsia="標楷體" w:cs="標楷體" w:hint="eastAsia"/>
+              </w:rPr>
+              <w:t>年度</w:t>
+            </w:r>
+            <w:r>
+              <w:rPr>
+                <w:rFonts w:ascii="標楷體" w:eastAsia="標楷體" w:cs="標楷體"/>
+              </w:rPr>
+              <w:t xml:space="preserve">       </w:t>
+            </w:r>
+            <w:r>
+              <w:rPr>
+                <w:rFonts w:ascii="標楷體" w:eastAsia="標楷體" w:cs="標楷體" w:hint="eastAsia"/>
+              </w:rPr>
+              <w:t>字第</w:t>
+            </w:r>
+            <w:r>
+              <w:rPr>
+                <w:rFonts w:ascii="標楷體" w:eastAsia="標楷體" w:cs="標楷體"/>
+              </w:rPr>
+              <w:t xml:space="preserve">      </w:t>
+            </w:r>
+            <w:r>
+              <w:rPr>
+                <w:rFonts w:ascii="標楷體" w:eastAsia="標楷體" w:cs="標楷體" w:hint="eastAsia"/>
+              </w:rPr>
+              <w:t>號</w:t>
+            </w:r>
+            <w:r>
+              <w:rPr>
+                <w:rFonts w:ascii="標楷體" w:eastAsia="標楷體" w:cs="標楷體"/>
+              </w:rPr>
+              <w:t xml:space="preserve">   </w:t>
+            </w:r>
+            <w:r>
+              <w:rPr>
+                <w:rFonts w:ascii="標楷體" w:eastAsia="標楷體" w:cs="標楷體" w:hint="eastAsia"/>
+              </w:rPr>
+              <w:t>股</w:t>
             </w:r>
           </w:p>
         </w:tc>
@@ -595,7 +675,24 @@
             <w:vAlign w:val="center"/>
           </w:tcPr>
           <w:p>
-            <w:r>
+            <w:pPr>
+              <w:spacing w:line="360" w:lineRule="exact"/>
+              <w:jc w:val="center"/>
+              <w:rPr>
+                <w:rFonts w:ascii="標楷體" w:eastAsia="標楷體" w:hAnsi="標楷體" w:cs="標楷體"/>
+                <w:noProof/>
+                <w:kern w:val="2"/>
+                <w:sz w:val="28"/>
+                <w:szCs w:val="28"/>
+              </w:rPr>
+            </w:pPr>
+            <w:r>
+              <w:rPr>
+                <w:rFonts w:ascii="標楷體" w:eastAsia="標楷體" w:hAnsi="標楷體" w:cs="標楷體" w:hint="eastAsia"/>
+                <w:noProof/>
+                <w:sz w:val="28"/>
+                <w:szCs w:val="28"/>
+              </w:rPr>
               <w:t>{{CLIENT_NAME}}</w:t>
             </w:r>
           </w:p>
@@ -612,9 +709,23 @@
             <w:vAlign w:val="center"/>
           </w:tcPr>
           <w:p>
-            <w:r>
+            <w:pPr>
+              <w:spacing w:line="240" w:lineRule="atLeast"/>
+              <w:ind w:left="180"/>
+              <w:rPr>
+                <w:rFonts w:ascii="標楷體" w:eastAsia="標楷體" w:cs="標楷體"/>
+              </w:rPr>
+            </w:pPr>
+            <w:r>
+              <w:rPr>
+                <w:rFonts w:ascii="標楷體" w:eastAsia="標楷體" w:hAnsi="標楷體" w:cs="標楷體" w:hint="eastAsia"/>
+                <w:sz w:val="36"/>
+                <w:szCs w:val="44"/>
+              </w:rPr>
               <w:t>{{LAWYER_NAME}}</w:t>
             </w:r>
+            <w:bookmarkStart w:id="0" w:name="_GoBack"/>
+            <w:bookmarkEnd w:id="0"/>
           </w:p>
         </w:tc>
       </w:tr>
@@ -663,7 +774,24 @@
             <w:vAlign w:val="center"/>
           </w:tcPr>
           <w:p>
-            <w:r>
+            <w:pPr>
+              <w:spacing w:line="360" w:lineRule="exact"/>
+              <w:jc w:val="center"/>
+              <w:rPr>
+                <w:rFonts w:ascii="標楷體" w:eastAsia="標楷體" w:hAnsi="標楷體" w:cs="標楷體"/>
+                <w:noProof/>
+                <w:kern w:val="2"/>
+                <w:sz w:val="28"/>
+                <w:szCs w:val="28"/>
+              </w:rPr>
+            </w:pPr>
+            <w:r>
+              <w:rPr>
+                <w:rFonts w:ascii="標楷體" w:eastAsia="標楷體" w:hAnsi="標楷體" w:cs="標楷體" w:hint="eastAsia"/>
+                <w:noProof/>
+                <w:sz w:val="28"/>
+                <w:szCs w:val="28"/>
+              </w:rPr>
               <w:t>{{CLIENT_BIRTHDAY}}</w:t>
             </w:r>
           </w:p>
@@ -750,7 +878,24 @@
             <w:vAlign w:val="center"/>
           </w:tcPr>
           <w:p>
-            <w:r>
+            <w:pPr>
+              <w:spacing w:line="360" w:lineRule="exact"/>
+              <w:jc w:val="center"/>
+              <w:rPr>
+                <w:rFonts w:ascii="標楷體" w:eastAsia="標楷體" w:hAnsi="標楷體" w:cs="標楷體"/>
+                <w:noProof/>
+                <w:kern w:val="2"/>
+                <w:sz w:val="28"/>
+                <w:szCs w:val="28"/>
+              </w:rPr>
+            </w:pPr>
+            <w:r>
+              <w:rPr>
+                <w:rFonts w:ascii="標楷體" w:eastAsia="標楷體" w:hAnsi="標楷體" w:cs="標楷體" w:hint="eastAsia"/>
+                <w:noProof/>
+                <w:sz w:val="28"/>
+                <w:szCs w:val="28"/>
+              </w:rPr>
               <w:t>{{CLIENT_ID}}</w:t>
             </w:r>
           </w:p>
@@ -950,6 +1095,14 @@
               </w:rPr>
               <w:t>事務所地址及電話：</w:t>
             </w:r>
+            <w:r>
+              <w:rPr>
+                <w:rFonts w:ascii="標楷體" w:eastAsia="標楷體" w:cs="標楷體"/>
+                <w:sz w:val="22"/>
+                <w:szCs w:val="22"/>
+              </w:rPr>
+              <w:t>{{LAW_FIRM_ADDRESS_LINE}}　電話：{{LAW_FIRM_PHONE}}</w:t>
+            </w:r>
           </w:p>
         </w:tc>
       </w:tr>
@@ -1028,9 +1181,14 @@
             <w:vAlign w:val="center"/>
           </w:tcPr>
           <w:p>
-            <w:r>
-              <w:t>{{LAW_FIRM_ADDRESS_LINE}}　電話：{{LAW_FIRM_PHONE}}</w:t>
-            </w:r>
+            <w:pPr>
+              <w:spacing w:line="240" w:lineRule="atLeast"/>
+              <w:ind w:left="180"/>
+              <w:jc w:val="center"/>
+              <w:rPr>
+                <w:rFonts w:ascii="標楷體" w:eastAsia="標楷體" w:cs="標楷體"/>
+              </w:rPr>
+            </w:pPr>
           </w:p>
         </w:tc>
       </w:tr>
@@ -1115,9 +1273,14 @@
             <w:vAlign w:val="center"/>
           </w:tcPr>
           <w:p>
-            <w:r>
-              <w:t>傳真：{{LAW_FIRM_FAX}}</w:t>
-            </w:r>
+            <w:pPr>
+              <w:spacing w:line="240" w:lineRule="atLeast"/>
+              <w:ind w:left="180"/>
+              <w:jc w:val="center"/>
+              <w:rPr>
+                <w:rFonts w:ascii="標楷體" w:eastAsia="標楷體" w:cs="標楷體"/>
+              </w:rPr>
+            </w:pPr>
           </w:p>
         </w:tc>
       </w:tr>
@@ -1187,9 +1350,14 @@
             <w:vAlign w:val="center"/>
           </w:tcPr>
           <w:p>
-            <w:r>
-              <w:t>手機：{{LAW_FIRM_MOBILE}}</w:t>
-            </w:r>
+            <w:pPr>
+              <w:spacing w:line="240" w:lineRule="atLeast"/>
+              <w:ind w:left="180"/>
+              <w:jc w:val="center"/>
+              <w:rPr>
+                <w:rFonts w:ascii="標楷體" w:eastAsia="標楷體" w:cs="標楷體"/>
+              </w:rPr>
+            </w:pPr>
           </w:p>
         </w:tc>
       </w:tr>
@@ -1256,8 +1424,71 @@
             </w:tcBorders>
           </w:tcPr>
           <w:p>
-            <w:r>
-              <w:t>為 {{CASE_REASON}} 事（案）件，委任人茲委任受任人為</w:t>
+            <w:pPr>
+              <w:spacing w:line="240" w:lineRule="atLeast"/>
+              <w:rPr>
+                <w:rFonts w:ascii="標楷體" w:eastAsia="標楷體" w:cs="標楷體"/>
+                <w:sz w:val="28"/>
+                <w:szCs w:val="28"/>
+              </w:rPr>
+            </w:pPr>
+            <w:r>
+              <w:rPr>
+                <w:rFonts w:ascii="標楷體" w:eastAsia="標楷體" w:cs="標楷體" w:hint="eastAsia"/>
+                <w:sz w:val="28"/>
+                <w:szCs w:val="28"/>
+              </w:rPr>
+              <w:t>為</w:t>
+            </w:r>
+            <w:r>
+              <w:rPr>
+                <w:rFonts w:ascii="標楷體" w:eastAsia="標楷體" w:cs="標楷體"/>
+                <w:sz w:val="28"/>
+                <w:szCs w:val="28"/>
+              </w:rPr>
+              <w:t>{{CASE_REASON}}</w:t>
+            </w:r>
+            <w:r>
+              <w:rPr>
+                <w:rFonts w:ascii="標楷體" w:eastAsia="標楷體" w:cs="標楷體" w:hint="eastAsia"/>
+                <w:sz w:val="28"/>
+                <w:szCs w:val="28"/>
+              </w:rPr>
+              <w:t xml:space="preserve">　　　　</w:t>
+            </w:r>
+            <w:r>
+              <w:rPr>
+                <w:rFonts w:ascii="標楷體" w:eastAsia="標楷體" w:cs="標楷體"/>
+                <w:sz w:val="28"/>
+                <w:szCs w:val="28"/>
+              </w:rPr>
+              <w:t xml:space="preserve">      </w:t>
+            </w:r>
+            <w:r>
+              <w:rPr>
+                <w:rFonts w:ascii="標楷體" w:eastAsia="標楷體" w:cs="標楷體" w:hint="eastAsia"/>
+                <w:sz w:val="28"/>
+                <w:szCs w:val="28"/>
+              </w:rPr>
+              <w:t>事（案）件，</w:t>
+            </w:r>
+            <w:proofErr w:type="gramStart"/>
+            <w:r>
+              <w:rPr>
+                <w:rFonts w:ascii="標楷體" w:eastAsia="標楷體" w:cs="標楷體" w:hint="eastAsia"/>
+                <w:sz w:val="28"/>
+                <w:szCs w:val="28"/>
+              </w:rPr>
+              <w:t>委任人茲委任</w:t>
+            </w:r>
+            <w:proofErr w:type="gramEnd"/>
+            <w:r>
+              <w:rPr>
+                <w:rFonts w:ascii="標楷體" w:eastAsia="標楷體" w:cs="標楷體" w:hint="eastAsia"/>
+                <w:sz w:val="28"/>
+                <w:szCs w:val="28"/>
+              </w:rPr>
+              <w:t>受任人為</w:t>
             </w:r>
           </w:p>
         </w:tc>
@@ -1303,8 +1534,108 @@
             <w:vAlign w:val="center"/>
           </w:tcPr>
           <w:p>
-            <w:r>
-              <w:t>{{STAGE_MARKS}}</w:t>
+            <w:pPr>
+              <w:spacing w:line="280" w:lineRule="exact"/>
+              <w:rPr>
+                <w:rFonts w:ascii="標楷體" w:eastAsia="標楷體" w:cs="標楷體"/>
+                <w:sz w:val="28"/>
+                <w:szCs w:val="28"/>
+              </w:rPr>
+            </w:pPr>
+            <w:r>
+              <w:rPr>
+                <w:rFonts w:ascii="標楷體" w:eastAsia="標楷體" w:cs="標楷體" w:hint="eastAsia"/>
+                <w:sz w:val="28"/>
+                <w:szCs w:val="28"/>
+              </w:rPr>
+              <w:t>□第　　審</w:t>
+            </w:r>
+          </w:p>
+          <w:p>
+            <w:pPr>
+              <w:spacing w:line="280" w:lineRule="exact"/>
+              <w:rPr>
+                <w:rFonts w:ascii="標楷體" w:eastAsia="標楷體" w:cs="標楷體"/>
+                <w:sz w:val="28"/>
+                <w:szCs w:val="28"/>
+              </w:rPr>
+            </w:pPr>
+            <w:r>
+              <w:rPr>
+                <w:rFonts w:ascii="標楷體" w:eastAsia="標楷體" w:cs="標楷體" w:hint="eastAsia"/>
+                <w:sz w:val="28"/>
+                <w:szCs w:val="28"/>
+              </w:rPr>
+              <w:t>□</w:t>
+            </w:r>
+            <w:proofErr w:type="gramStart"/>
+            <w:r>
+              <w:rPr>
+                <w:rFonts w:ascii="標楷體" w:eastAsia="標楷體" w:cs="標楷體" w:hint="eastAsia"/>
+                <w:sz w:val="28"/>
+                <w:szCs w:val="28"/>
+              </w:rPr>
+              <w:t>偵</w:t>
+            </w:r>
+            <w:proofErr w:type="gramEnd"/>
+            <w:r>
+              <w:rPr>
+                <w:rFonts w:ascii="標楷體" w:eastAsia="標楷體" w:cs="標楷體"/>
+                <w:sz w:val="28"/>
+                <w:szCs w:val="28"/>
+              </w:rPr>
+              <w:t xml:space="preserve"> </w:t>
+            </w:r>
+            <w:r>
+              <w:rPr>
+                <w:rFonts w:ascii="標楷體" w:eastAsia="標楷體" w:cs="標楷體" w:hint="eastAsia"/>
+                <w:sz w:val="28"/>
+                <w:szCs w:val="28"/>
+              </w:rPr>
+              <w:t>查</w:t>
+            </w:r>
+            <w:r>
+              <w:rPr>
+                <w:rFonts w:ascii="標楷體" w:eastAsia="標楷體" w:cs="標楷體"/>
+                <w:sz w:val="28"/>
+                <w:szCs w:val="28"/>
+              </w:rPr>
+              <w:t xml:space="preserve"> </w:t>
+            </w:r>
+            <w:r>
+              <w:rPr>
+                <w:rFonts w:ascii="標楷體" w:eastAsia="標楷體" w:cs="標楷體" w:hint="eastAsia"/>
+                <w:sz w:val="28"/>
+                <w:szCs w:val="28"/>
+              </w:rPr>
+              <w:t>中</w:t>
+            </w:r>
+          </w:p>
+          <w:p>
+            <w:pPr>
+              <w:spacing w:line="280" w:lineRule="exact"/>
+              <w:rPr>
+                <w:rFonts w:ascii="標楷體" w:eastAsia="標楷體" w:cs="標楷體"/>
+                <w:sz w:val="28"/>
+                <w:szCs w:val="28"/>
+              </w:rPr>
+            </w:pPr>
+            <w:r>
+              <w:rPr>
+                <w:rFonts w:ascii="標楷體" w:eastAsia="標楷體" w:cs="標楷體" w:hint="eastAsia"/>
+                <w:sz w:val="28"/>
+                <w:szCs w:val="28"/>
+              </w:rPr>
+              <w:t>□</w:t>
+            </w:r>
+            <w:r>
+              <w:rPr>
+                <w:rFonts w:ascii="標楷體" w:eastAsia="標楷體" w:cs="標楷體"/>
+                <w:sz w:val="28"/>
+                <w:szCs w:val="28"/>
+                <w:u w:val="single"/>
+              </w:rPr>
+              <w:t xml:space="preserve">             </w:t>
             </w:r>
           </w:p>
         </w:tc>
@@ -1315,8 +1646,171 @@
             <w:vAlign w:val="center"/>
           </w:tcPr>
           <w:p>
-            <w:r>
-              <w:t>{{ROLE_MARKS}}</w:t>
+            <w:pPr>
+              <w:spacing w:line="280" w:lineRule="exact"/>
+              <w:rPr>
+                <w:rFonts w:ascii="標楷體" w:eastAsia="標楷體" w:cs="標楷體"/>
+                <w:sz w:val="28"/>
+                <w:szCs w:val="28"/>
+              </w:rPr>
+            </w:pPr>
+            <w:r>
+              <w:rPr>
+                <w:rFonts w:ascii="標楷體" w:eastAsia="標楷體" w:cs="標楷體" w:hint="eastAsia"/>
+                <w:sz w:val="28"/>
+                <w:szCs w:val="28"/>
+              </w:rPr>
+              <w:t>□代</w:t>
+            </w:r>
+            <w:r>
+              <w:rPr>
+                <w:rFonts w:ascii="標楷體" w:eastAsia="標楷體" w:cs="標楷體"/>
+                <w:sz w:val="28"/>
+                <w:szCs w:val="28"/>
+              </w:rPr>
+              <w:t xml:space="preserve">  </w:t>
+            </w:r>
+            <w:r>
+              <w:rPr>
+                <w:rFonts w:ascii="標楷體" w:eastAsia="標楷體" w:cs="標楷體" w:hint="eastAsia"/>
+                <w:sz w:val="28"/>
+                <w:szCs w:val="28"/>
+              </w:rPr>
+              <w:t>理</w:t>
+            </w:r>
+            <w:r>
+              <w:rPr>
+                <w:rFonts w:ascii="標楷體" w:eastAsia="標楷體" w:cs="標楷體"/>
+                <w:sz w:val="28"/>
+                <w:szCs w:val="28"/>
+              </w:rPr>
+              <w:t xml:space="preserve">  </w:t>
+            </w:r>
+            <w:r>
+              <w:rPr>
+                <w:rFonts w:ascii="標楷體" w:eastAsia="標楷體" w:cs="標楷體" w:hint="eastAsia"/>
+                <w:sz w:val="28"/>
+                <w:szCs w:val="28"/>
+              </w:rPr>
+              <w:t>人</w:t>
+            </w:r>
+          </w:p>
+          <w:p>
+            <w:pPr>
+              <w:spacing w:line="280" w:lineRule="exact"/>
+              <w:rPr>
+                <w:rFonts w:ascii="標楷體" w:eastAsia="標楷體" w:cs="標楷體"/>
+                <w:sz w:val="28"/>
+                <w:szCs w:val="28"/>
+              </w:rPr>
+            </w:pPr>
+            <w:r>
+              <w:rPr>
+                <w:rFonts w:ascii="標楷體" w:eastAsia="標楷體" w:cs="標楷體" w:hint="eastAsia"/>
+                <w:sz w:val="28"/>
+                <w:szCs w:val="28"/>
+              </w:rPr>
+              <w:t>□告訴代理人</w:t>
+            </w:r>
+          </w:p>
+          <w:p>
+            <w:pPr>
+              <w:spacing w:line="280" w:lineRule="exact"/>
+              <w:rPr>
+                <w:rFonts w:ascii="標楷體" w:eastAsia="標楷體" w:cs="標楷體"/>
+                <w:sz w:val="28"/>
+                <w:szCs w:val="28"/>
+              </w:rPr>
+            </w:pPr>
+            <w:r>
+              <w:rPr>
+                <w:rFonts w:ascii="標楷體" w:eastAsia="標楷體" w:cs="標楷體" w:hint="eastAsia"/>
+                <w:sz w:val="28"/>
+                <w:szCs w:val="28"/>
+              </w:rPr>
+              <w:t>□辯</w:t>
+            </w:r>
+            <w:r>
+              <w:rPr>
+                <w:rFonts w:ascii="標楷體" w:eastAsia="標楷體" w:cs="標楷體"/>
+                <w:sz w:val="28"/>
+                <w:szCs w:val="28"/>
+              </w:rPr>
+              <w:t xml:space="preserve">  </w:t>
+            </w:r>
+            <w:r>
+              <w:rPr>
+                <w:rFonts w:ascii="標楷體" w:eastAsia="標楷體" w:cs="標楷體" w:hint="eastAsia"/>
+                <w:sz w:val="28"/>
+                <w:szCs w:val="28"/>
+              </w:rPr>
+              <w:t>護</w:t>
+            </w:r>
+            <w:r>
+              <w:rPr>
+                <w:rFonts w:ascii="標楷體" w:eastAsia="標楷體" w:cs="標楷體"/>
+                <w:sz w:val="28"/>
+                <w:szCs w:val="28"/>
+              </w:rPr>
+              <w:t xml:space="preserve">  </w:t>
+            </w:r>
+            <w:r>
+              <w:rPr>
+                <w:rFonts w:ascii="標楷體" w:eastAsia="標楷體" w:cs="標楷體" w:hint="eastAsia"/>
+                <w:sz w:val="28"/>
+                <w:szCs w:val="28"/>
+              </w:rPr>
+              <w:t>人</w:t>
+            </w:r>
+          </w:p>
+          <w:p>
+            <w:pPr>
+              <w:spacing w:line="280" w:lineRule="exact"/>
+              <w:rPr>
+                <w:rFonts w:ascii="標楷體" w:eastAsia="標楷體" w:cs="標楷體"/>
+                <w:sz w:val="28"/>
+                <w:szCs w:val="28"/>
+              </w:rPr>
+            </w:pPr>
+            <w:r>
+              <w:rPr>
+                <w:rFonts w:ascii="標楷體" w:eastAsia="標楷體" w:hAnsi="標楷體" w:cs="標楷體" w:hint="eastAsia"/>
+                <w:sz w:val="28"/>
+                <w:szCs w:val="28"/>
+              </w:rPr>
+              <w:t>□輔</w:t>
+            </w:r>
+            <w:r>
+              <w:rPr>
+                <w:rFonts w:ascii="標楷體" w:eastAsia="標楷體" w:hAnsi="標楷體" w:cs="標楷體"/>
+                <w:sz w:val="28"/>
+                <w:szCs w:val="28"/>
+              </w:rPr>
+              <w:t xml:space="preserve">  </w:t>
+            </w:r>
+            <w:r>
+              <w:rPr>
+                <w:rFonts w:ascii="標楷體" w:eastAsia="標楷體" w:hAnsi="標楷體" w:cs="標楷體" w:hint="eastAsia"/>
+                <w:sz w:val="28"/>
+                <w:szCs w:val="28"/>
+              </w:rPr>
+              <w:t>佐</w:t>
+            </w:r>
+            <w:r>
+              <w:rPr>
+                <w:rFonts w:ascii="標楷體" w:eastAsia="標楷體" w:hAnsi="標楷體" w:cs="標楷體"/>
+                <w:sz w:val="28"/>
+                <w:szCs w:val="28"/>
+              </w:rPr>
+              <w:t xml:space="preserve">  </w:t>
+            </w:r>
+            <w:r>
+              <w:rPr>
+                <w:rFonts w:ascii="標楷體" w:eastAsia="標楷體" w:hAnsi="標楷體" w:cs="標楷體" w:hint="eastAsia"/>
+                <w:sz w:val="28"/>
+                <w:szCs w:val="28"/>
+              </w:rPr>
+              <w:t>人</w:t>
             </w:r>
           </w:p>
         </w:tc>
@@ -1464,9 +1958,213 @@
             </w:tcBorders>
           </w:tcPr>
           <w:p>
-            <w:r>
-              <w:t>謹 致 {{COURT_LINE}} 公鑒</w:t>
-            </w:r>
+            <w:pPr>
+              <w:spacing w:line="400" w:lineRule="exact"/>
+              <w:ind w:firstLineChars="800" w:firstLine="2240"/>
+              <w:rPr>
+                <w:rFonts w:ascii="標楷體" w:eastAsia="標楷體" w:cs="標楷體"/>
+                <w:sz w:val="28"/>
+                <w:szCs w:val="28"/>
+              </w:rPr>
+            </w:pPr>
+            <w:r>
+              <w:rPr>
+                <w:rFonts w:ascii="標楷體" w:eastAsia="標楷體" w:cs="標楷體" w:hint="eastAsia"/>
+                <w:sz w:val="28"/>
+                <w:szCs w:val="28"/>
+              </w:rPr>
+              <w:t>謹　　致</w:t>
+            </w:r>
+          </w:p>
+          <w:p>
+            <w:pPr>
+              <w:spacing w:line="600" w:lineRule="exact"/>
+              <w:rPr>
+                <w:rFonts w:ascii="標楷體" w:eastAsia="標楷體" w:cs="標楷體"/>
+                <w:sz w:val="28"/>
+                <w:szCs w:val="28"/>
+              </w:rPr>
+            </w:pPr>
+            <w:r>
+              <w:rPr>
+                <w:rFonts w:ascii="標楷體" w:eastAsia="標楷體" w:hAnsi="標楷體" w:cs="標楷體" w:hint="eastAsia"/>
+                <w:sz w:val="28"/>
+                <w:szCs w:val="28"/>
+              </w:rPr>
+              <w:t>□</w:t>
+            </w:r>
+            <w:r>
+              <w:rPr>
+                <w:rFonts w:ascii="標楷體" w:eastAsia="標楷體" w:hAnsi="標楷體" w:cs="標楷體" w:hint="eastAsia"/>
+                <w:sz w:val="28"/>
+                <w:szCs w:val="28"/>
+                <w:u w:val="single"/>
+              </w:rPr>
+              <w:t xml:space="preserve">                 </w:t>
+            </w:r>
+            <w:r>
+              <w:rPr>
+                <w:rFonts w:ascii="標楷體" w:eastAsia="標楷體" w:hAnsi="標楷體" w:cs="標楷體" w:hint="eastAsia"/>
+                <w:sz w:val="28"/>
+                <w:szCs w:val="28"/>
+              </w:rPr>
+              <w:t>法  院</w:t>
+            </w:r>
+            <w:r>
+              <w:rPr>
+                <w:rFonts w:ascii="標楷體" w:eastAsia="標楷體" w:hAnsi="標楷體" w:cs="標楷體" w:hint="eastAsia"/>
+                <w:sz w:val="28"/>
+                <w:szCs w:val="28"/>
+                <w:u w:val="single"/>
+              </w:rPr>
+              <w:t xml:space="preserve">                </w:t>
+            </w:r>
+            <w:r>
+              <w:rPr>
+                <w:rFonts w:ascii="標楷體" w:eastAsia="標楷體" w:hAnsi="標楷體" w:cs="標楷體" w:hint="eastAsia"/>
+                <w:sz w:val="28"/>
+                <w:szCs w:val="28"/>
+              </w:rPr>
+              <w:t xml:space="preserve">   </w:t>
+            </w:r>
+          </w:p>
+          <w:p>
+            <w:pPr>
+              <w:spacing w:line="600" w:lineRule="exact"/>
+              <w:rPr>
+                <w:rFonts w:ascii="標楷體" w:eastAsia="標楷體" w:cs="標楷體"/>
+                <w:sz w:val="28"/>
+                <w:szCs w:val="28"/>
+              </w:rPr>
+            </w:pPr>
+            <w:r>
+              <w:rPr>
+                <w:rFonts w:ascii="標楷體" w:eastAsia="標楷體" w:hAnsi="標楷體" w:cs="標楷體" w:hint="eastAsia"/>
+                <w:sz w:val="28"/>
+                <w:szCs w:val="28"/>
+              </w:rPr>
+              <w:t>□</w:t>
+            </w:r>
+            <w:r>
+              <w:rPr>
+                <w:rFonts w:ascii="標楷體" w:eastAsia="標楷體" w:hAnsi="標楷體" w:cs="標楷體" w:hint="eastAsia"/>
+                <w:sz w:val="28"/>
+                <w:szCs w:val="28"/>
+                <w:u w:val="single"/>
+              </w:rPr>
+              <w:t xml:space="preserve">                 </w:t>
+            </w:r>
+            <w:r>
+              <w:rPr>
+                <w:rFonts w:ascii="標楷體" w:eastAsia="標楷體" w:hAnsi="標楷體" w:cs="標楷體" w:hint="eastAsia"/>
+                <w:sz w:val="28"/>
+                <w:szCs w:val="28"/>
+              </w:rPr>
+              <w:t>檢察署</w:t>
+            </w:r>
+            <w:r>
+              <w:rPr>
+                <w:rFonts w:ascii="標楷體" w:eastAsia="標楷體" w:hAnsi="標楷體" w:cs="標楷體" w:hint="eastAsia"/>
+                <w:sz w:val="28"/>
+                <w:szCs w:val="28"/>
+                <w:u w:val="single"/>
+              </w:rPr>
+              <w:t xml:space="preserve">                </w:t>
+            </w:r>
+            <w:r>
+              <w:rPr>
+                <w:rFonts w:ascii="標楷體" w:eastAsia="標楷體" w:hAnsi="標楷體" w:cs="標楷體" w:hint="eastAsia"/>
+                <w:sz w:val="28"/>
+                <w:szCs w:val="28"/>
+              </w:rPr>
+              <w:t xml:space="preserve">   □轉呈</w:t>
+            </w:r>
+          </w:p>
+          <w:p>
+            <w:pPr>
+              <w:spacing w:line="600" w:lineRule="exact"/>
+              <w:rPr>
+                <w:rFonts w:ascii="標楷體" w:eastAsia="標楷體" w:cs="標楷體"/>
+                <w:sz w:val="28"/>
+                <w:szCs w:val="28"/>
+              </w:rPr>
+            </w:pPr>
+            <w:r>
+              <w:rPr>
+                <w:rFonts w:ascii="標楷體" w:eastAsia="標楷體" w:hAnsi="標楷體" w:cs="標楷體" w:hint="eastAsia"/>
+                <w:sz w:val="28"/>
+                <w:szCs w:val="28"/>
+              </w:rPr>
+              <w:t>□</w:t>
+            </w:r>
+            <w:r>
+              <w:rPr>
+                <w:rFonts w:ascii="標楷體" w:eastAsia="標楷體" w:hAnsi="標楷體" w:cs="標楷體" w:hint="eastAsia"/>
+                <w:sz w:val="28"/>
+                <w:szCs w:val="28"/>
+                <w:u w:val="single"/>
+              </w:rPr>
+              <w:t xml:space="preserve">　　　           </w:t>
+            </w:r>
+            <w:r>
+              <w:rPr>
+                <w:rFonts w:ascii="標楷體" w:eastAsia="標楷體" w:hAnsi="標楷體" w:cs="標楷體" w:hint="eastAsia"/>
+                <w:sz w:val="28"/>
+                <w:szCs w:val="28"/>
+              </w:rPr>
+              <w:t>委員會</w:t>
+            </w:r>
+          </w:p>
+          <w:p>
+            <w:pPr>
+              <w:spacing w:line="600" w:lineRule="exact"/>
+              <w:rPr>
+                <w:rFonts w:ascii="標楷體" w:eastAsia="標楷體" w:hAnsi="標楷體" w:cs="標楷體"/>
+                <w:sz w:val="28"/>
+                <w:szCs w:val="28"/>
+              </w:rPr>
+            </w:pPr>
+            <w:r>
+              <w:rPr>
+                <w:rFonts w:ascii="標楷體" w:eastAsia="標楷體" w:hAnsi="標楷體" w:cs="標楷體" w:hint="eastAsia"/>
+                <w:sz w:val="28"/>
+                <w:szCs w:val="28"/>
+                <w:u w:val="single"/>
+              </w:rPr>
+              <w:t xml:space="preserve">                                   </w:t>
+            </w:r>
+            <w:r>
+              <w:rPr>
+                <w:rFonts w:ascii="標楷體" w:eastAsia="標楷體" w:hAnsi="標楷體" w:cs="標楷體" w:hint="eastAsia"/>
+                <w:sz w:val="28"/>
+                <w:szCs w:val="28"/>
+              </w:rPr>
+              <w:t xml:space="preserve">           公鑒</w:t>
+            </w:r>
+          </w:p>
+          <w:p>
+            <w:pPr>
+              <w:spacing w:line="600" w:lineRule="exact"/>
+              <w:rPr>
+                <w:rFonts w:ascii="標楷體" w:eastAsia="標楷體" w:hAnsi="標楷體" w:cs="標楷體"/>
+                <w:sz w:val="28"/>
+                <w:szCs w:val="28"/>
+              </w:rPr>
+            </w:pPr>
+          </w:p>
+          <w:p>
+            <w:pPr>
+              <w:tabs>
+                <w:tab w:val="left" w:pos="460"/>
+              </w:tabs>
+              <w:spacing w:line="240" w:lineRule="exact"/>
+              <w:ind w:right="113"/>
+              <w:jc w:val="both"/>
+              <w:rPr>
+                <w:sz w:val="28"/>
+                <w:szCs w:val="28"/>
+              </w:rPr>
+            </w:pPr>
           </w:p>
         </w:tc>
       </w:tr>
@@ -1526,9 +2224,13 @@
             </w:tcBorders>
           </w:tcPr>
           <w:p>
-            <w:r>
-              <w:t>{{CLIENT_NAME}}</w:t>
-            </w:r>
+            <w:pPr>
+              <w:spacing w:line="300" w:lineRule="exact"/>
+              <w:rPr>
+                <w:sz w:val="28"/>
+                <w:szCs w:val="28"/>
+              </w:rPr>
+            </w:pPr>
           </w:p>
         </w:tc>
       </w:tr>
@@ -1613,9 +2315,13 @@
             </w:tcBorders>
           </w:tcPr>
           <w:p>
-            <w:r>
-              <w:t>{{LAWYER_NAME}}</w:t>
-            </w:r>
+            <w:pPr>
+              <w:spacing w:line="300" w:lineRule="exact"/>
+              <w:rPr>
+                <w:sz w:val="28"/>
+                <w:szCs w:val="28"/>
+              </w:rPr>
+            </w:pPr>
           </w:p>
         </w:tc>
       </w:tr>
@@ -1659,8 +2365,119 @@
             </w:tcBorders>
           </w:tcPr>
           <w:p>
-            <w:r>
-              <w:t>本事件經本會　{{BRANCH_LABEL}}審核准予扶助，爰制作本委任狀如上，自105年10月1日起，本會不再蓋委任狀章。如欲反應律師辦理狀況，請逕致電分會({{BRANCH_PHONE}})。</w:t>
+            <w:pPr>
+              <w:spacing w:line="300" w:lineRule="exact"/>
+              <w:rPr>
+                <w:rFonts w:ascii="標楷體" w:eastAsia="標楷體" w:cs="標楷體"/>
+              </w:rPr>
+            </w:pPr>
+            <w:r>
+              <w:rPr>
+                <w:rFonts w:ascii="標楷體" w:eastAsia="標楷體" w:hAnsi="標楷體" w:cs="標楷體" w:hint="eastAsia"/>
+              </w:rPr>
+              <w:t xml:space="preserve">本事件經本會　</w:t>
+            </w:r>
+            <w:r>
+              <w:rPr>
+                <w:rFonts w:ascii="標楷體" w:eastAsia="標楷體" w:hAnsi="標楷體" w:cs="標楷體" w:hint="eastAsia"/>
+                <w:noProof/>
+              </w:rPr>
+              <w:t>{{BRANCH_LABEL}}</w:t>
+            </w:r>
+            <w:r>
+              <w:rPr>
+                <w:rFonts w:ascii="標楷體" w:eastAsia="標楷體" w:hAnsi="標楷體" w:cs="標楷體" w:hint="eastAsia"/>
+              </w:rPr>
+              <w:t>審核准予扶助，</w:t>
+            </w:r>
+            <w:proofErr w:type="gramStart"/>
+            <w:r>
+              <w:rPr>
+                <w:rFonts w:ascii="標楷體" w:eastAsia="標楷體" w:hAnsi="標楷體" w:cs="標楷體" w:hint="eastAsia"/>
+              </w:rPr>
+              <w:t>爰</w:t>
+            </w:r>
+            <w:proofErr w:type="gramEnd"/>
+            <w:r>
+              <w:rPr>
+                <w:rFonts w:ascii="標楷體" w:eastAsia="標楷體" w:hAnsi="標楷體" w:cs="標楷體" w:hint="eastAsia"/>
+              </w:rPr>
+              <w:t>制作本委任狀如上，自</w:t>
+            </w:r>
+            <w:r>
+              <w:rPr>
+                <w:rFonts w:ascii="標楷體" w:eastAsia="標楷體" w:hAnsi="標楷體" w:cs="標楷體"/>
+              </w:rPr>
+              <w:t>105</w:t>
+            </w:r>
+            <w:r>
+              <w:rPr>
+                <w:rFonts w:ascii="標楷體" w:eastAsia="標楷體" w:hAnsi="標楷體" w:cs="標楷體" w:hint="eastAsia"/>
+              </w:rPr>
+              <w:t>年</w:t>
+            </w:r>
+            <w:r>
+              <w:rPr>
+                <w:rFonts w:ascii="標楷體" w:eastAsia="標楷體" w:hAnsi="標楷體" w:cs="標楷體"/>
+              </w:rPr>
+              <w:t>10</w:t>
+            </w:r>
+            <w:r>
+              <w:rPr>
+                <w:rFonts w:ascii="標楷體" w:eastAsia="標楷體" w:hAnsi="標楷體" w:cs="標楷體" w:hint="eastAsia"/>
+              </w:rPr>
+              <w:t>月</w:t>
+            </w:r>
+            <w:r>
+              <w:rPr>
+                <w:rFonts w:ascii="標楷體" w:eastAsia="標楷體" w:hAnsi="標楷體" w:cs="標楷體"/>
+              </w:rPr>
+              <w:t>1</w:t>
+            </w:r>
+            <w:r>
+              <w:rPr>
+                <w:rFonts w:ascii="標楷體" w:eastAsia="標楷體" w:hAnsi="標楷體" w:cs="標楷體" w:hint="eastAsia"/>
+              </w:rPr>
+              <w:t>日起，本會不再蓋委任狀章。如欲反應律師辦理狀況，請</w:t>
+            </w:r>
+            <w:proofErr w:type="gramStart"/>
+            <w:r>
+              <w:rPr>
+                <w:rFonts w:ascii="標楷體" w:eastAsia="標楷體" w:hAnsi="標楷體" w:cs="標楷體" w:hint="eastAsia"/>
+              </w:rPr>
+              <w:t>逕</w:t>
+            </w:r>
+            <w:proofErr w:type="gramEnd"/>
+            <w:r>
+              <w:rPr>
+                <w:rFonts w:ascii="標楷體" w:eastAsia="標楷體" w:hAnsi="標楷體" w:cs="標楷體" w:hint="eastAsia"/>
+              </w:rPr>
+              <w:t>致電分會</w:t>
+            </w:r>
+            <w:r>
+              <w:rPr>
+                <w:rFonts w:ascii="標楷體" w:eastAsia="標楷體" w:hAnsi="標楷體" w:cs="標楷體"/>
+              </w:rPr>
+              <w:t>(</w:t>
+            </w:r>
+            <w:r>
+              <w:rPr>
+                <w:rFonts w:ascii="標楷體" w:eastAsia="標楷體" w:hAnsi="標楷體" w:cs="標楷體"/>
+                <w:noProof/>
+              </w:rPr>
+              <w:t>{{BRANCH_PHONE}}</w:t>
+            </w:r>
+            <w:r>
+              <w:rPr>
+                <w:rFonts w:ascii="標楷體" w:eastAsia="標楷體" w:hAnsi="標楷體" w:cs="標楷體"/>
+              </w:rPr>
+              <w:t>)</w:t>
+            </w:r>
+            <w:r>
+              <w:rPr>
+                <w:rFonts w:ascii="標楷體" w:eastAsia="標楷體" w:hAnsi="標楷體" w:cs="標楷體" w:hint="eastAsia"/>
+              </w:rPr>
+              <w:t>。</w:t>
             </w:r>
           </w:p>
         </w:tc>
@@ -1682,8 +2499,25 @@
             <w:vAlign w:val="center"/>
           </w:tcPr>
           <w:p>
-            <w:r>
-              <w:t>中 華 民 國 {{ROC_YEAR}} 年 {{ROC_MONTH}} 月 {{ROC_DAY}} 日</w:t>
+            <w:pPr>
+              <w:spacing w:line="300" w:lineRule="exact"/>
+              <w:rPr>
+                <w:rFonts w:ascii="標楷體" w:eastAsia="標楷體" w:cs="標楷體"/>
+              </w:rPr>
+            </w:pPr>
+            <w:r>
+              <w:rPr>
+                <w:rFonts w:ascii="標楷體" w:eastAsia="標楷體" w:cs="標楷體" w:hint="eastAsia"/>
+              </w:rPr>
+              <w:t>中　　　華　　　民　　　國</w:t>
+            </w:r>
+            <w:r>
+              <w:rPr>
+                <w:rFonts w:ascii="標楷體" w:eastAsia="標楷體" w:cs="標楷體"/>
+                <w:sz w:val="24"/>
+                <w:szCs w:val="24"/>
+              </w:rPr>
+              <w:t xml:space="preserve"> {{ROC_YEAR}} 年 {{ROC_MONTH}} 月 {{ROC_DAY}} 日</w:t>
             </w:r>
           </w:p>
         </w:tc>

</xml_diff>